<commit_message>
Update academic document doc_0.docx
Replace binary file HRCP-KKU-Academic/uploads/academic/14/doc_0.docx with an updated .docx version. This commit updates the uploaded academic document for entry 14; no source code changes.
</commit_message>
<xml_diff>
--- a/HRCP-KKU-Academic/uploads/academic/14/doc_0.docx
+++ b/HRCP-KKU-Academic/uploads/academic/14/doc_0.docx
@@ -749,7 +749,7 @@
           <w:szCs w:val="32"/>
           <w:lang w:val="en-US" w:eastAsia="en-GB"/>
         </w:rPr>
-        <w:t>✓]</w:t>
+        <w:t> ]</w:t>
       </w:r>
       <w:r>
         <w:rPr>
@@ -780,7 +780,7 @@
           <w:szCs w:val="32"/>
           <w:lang w:val="en-US" w:eastAsia="en-GB"/>
         </w:rPr>
-        <w:t>[]</w:t>
+        <w:t>[✓]</w:t>
       </w:r>
       <w:r>
         <w:rPr>
@@ -811,7 +811,7 @@
           <w:szCs w:val="32"/>
           <w:lang w:val="en-US" w:eastAsia="en-GB"/>
         </w:rPr>
-        <w:t>[]</w:t>
+        <w:t>[ ]</w:t>
       </w:r>
       <w:r>
         <w:rPr>

</xml_diff>